<commit_message>
Puiutu: every pigeon colour walks and pecks, all quests top-left, no more Rattania
- Pigeons: the five colours that only had one still sprite (v3 brown
  checkered, v4 pied, v6 red-banded, v7 blue-grey, v8 dark checkered) get
  walk and attack frames. gen_pigeon_frames.py recolours the grey pigeon's
  frames from each colour's own sprite, keeping its markings where the
  poses line up and matching by brightness where they do not.
- Quest plaques top-left show everything you are working on: the cat
  quests, Shelly, and the errands that live in the story (Agent Trotter's
  five fish, the Rat Emissary's two sharks), with faces and counts kept
  current. Trotter's fish are on the map too.
- Rattania is the Rat Federation everywhere: the ending cards, the bank's
  confession, the map region, and the lore document.

Co-Authored-By: Claude Opus 5.5 <noreply@anthropic.com>
</commit_message>
<xml_diff>
--- a/Puiutu_Game_Lore.docx
+++ b/Puiutu_Game_Lore.docx
@@ -553,7 +553,7 @@
           <w:sz w:val="28"/>
           <w:szCs w:val="28"/>
         </w:rPr>
-        <w:t xml:space="preserve">2.1 Rattania — Federatia Mousekevitchiana</w:t>
+        <w:t xml:space="preserve">2.1 Rat Federation — Federatia Mousekevitchiana</w:t>
       </w:r>
     </w:p>
     <w:p>
@@ -692,7 +692,7 @@
           <w:sz w:val="22"/>
           <w:szCs w:val="22"/>
         </w:rPr>
-        <w:t xml:space="preserve">Se numeste oficial 'Republica Populara Rattania' — democratic in nume</w:t>
+        <w:t xml:space="preserve">Se numeste oficial 'Rat Federation' — democratic in nume</w:t>
       </w:r>
     </w:p>
     <w:p>
@@ -719,7 +719,7 @@
           <w:sz w:val="22"/>
           <w:szCs w:val="22"/>
         </w:rPr>
-        <w:t xml:space="preserve">Rattania nu e pur si simplu rea. Are o poveste de resentiment cu un sambure de adevar, distorsionat in instrument de ura si putere.</w:t>
+        <w:t xml:space="preserve">Rat Federation nu e pur si simplu rea. Are o poveste de resentiment cu un sambure de adevar, distorsionat in instrument de ura si putere.</w:t>
       </w:r>
     </w:p>
     <w:p>
@@ -1811,7 +1811,7 @@
                 <w:sz w:val="20"/>
                 <w:szCs w:val="20"/>
               </w:rPr>
-              <w:t xml:space="preserve">Imprumuta Rattaniei SA construiasca armata</w:t>
+              <w:t xml:space="preserve">Imprumuta Rat Federation SA construiasca armata</w:t>
             </w:r>
           </w:p>
         </w:tc>
@@ -3290,7 +3290,7 @@
           <w:sz w:val="22"/>
           <w:szCs w:val="22"/>
         </w:rPr>
-        <w:t xml:space="preserve">The Sty nu iti fura libertatea direct. Iti vand iluzii de alegere. Rattania sau Feline Accord. Dreapta sau stanga. Niciodata: 'poate ambele sunt gresite.' Puiutu e periculos nu pentru ca e puternic — ci pentru ca a vazut a treia optiune si refuza sa cumpere niciuna din iluziile oferite.</w:t>
+        <w:t xml:space="preserve">The Sty nu iti fura libertatea direct. Iti vand iluzii de alegere. Rat Federation sau Feline Accord. Dreapta sau stanga. Niciodata: 'poate ambele sunt gresite.' Puiutu e periculos nu pentru ca e puternic — ci pentru ca a vazut a treia optiune si refuza sa cumpere niciuna din iluziile oferite.</w:t>
       </w:r>
     </w:p>
     <w:p>
@@ -3476,7 +3476,7 @@
           <w:sz w:val="22"/>
           <w:szCs w:val="22"/>
         </w:rPr>
-        <w:t xml:space="preserve">In Rattania: ordine si mandrie dar si teroare subtila. Sobolani care soptesc ce gandesc</w:t>
+        <w:t xml:space="preserve">In Rat Federation: ordine si mandrie dar si teroare subtila. Sobolani care soptesc ce gandesc</w:t>
       </w:r>
     </w:p>
     <w:p>
@@ -3641,7 +3641,7 @@
           <w:sz w:val="22"/>
           <w:szCs w:val="22"/>
         </w:rPr>
-        <w:t xml:space="preserve">Rattania: 'e un agent globalist'</w:t>
+        <w:t xml:space="preserve">Rat Federation: 'e un agent globalist'</w:t>
       </w:r>
     </w:p>
     <w:p>
@@ -3932,7 +3932,7 @@
           <w:sz w:val="22"/>
           <w:szCs w:val="22"/>
         </w:rPr>
-        <w:t xml:space="preserve">"Rattus Magnus inca conduce Rattania."</w:t>
+        <w:t xml:space="preserve">"Rattus Magnus inca conduce Rat Federation."</w:t>
       </w:r>
     </w:p>
     <w:p>
@@ -4766,7 +4766,7 @@
                 <w:sz w:val="20"/>
                 <w:szCs w:val="20"/>
               </w:rPr>
-              <w:t xml:space="preserve">Rattania / Federatia Mousekevitchiana</w:t>
+              <w:t xml:space="preserve">Rat Federation / Federatia Mousekevitchiana</w:t>
             </w:r>
           </w:p>
         </w:tc>

</xml_diff>